<commit_message>
POO S8 (Clases abstractas e interfaces): profundizacion rigurosa
</commit_message>
<xml_diff>
--- a/08-week/optional-activity/pdf/Actividad-Semana08.docx
+++ b/08-week/optional-activity/pdf/Actividad-Semana08.docx
@@ -430,7 +430,7 @@
           <w:sz w:val="22"/>
           <w:szCs w:val="22"/>
         </w:rPr>
-        <w:t xml:space="preserve">Definir una clase abstracta con un método abstracto.</w:t>
+        <w:t xml:space="preserve">Definir una clase abstracta con método abstracto y método concreto.</w:t>
       </w:r>
     </w:p>
     <w:p>
@@ -454,7 +454,7 @@
           <w:sz w:val="22"/>
           <w:szCs w:val="22"/>
         </w:rPr>
-        <w:t xml:space="preserve">Definir e implementar una interfaz.</w:t>
+        <w:t xml:space="preserve">Definir e implementar una interfaz (capacidad).</w:t>
       </w:r>
     </w:p>
     <w:p>
@@ -478,7 +478,7 @@
           <w:sz w:val="22"/>
           <w:szCs w:val="22"/>
         </w:rPr>
-        <w:t xml:space="preserve">Usar polimorfismo por superclase y por interfaz.</w:t>
+        <w:t xml:space="preserve">Usar polimorfismo por superclase y por interfaz en el mismo programa.</w:t>
       </w:r>
     </w:p>
     <w:p>
@@ -521,7 +521,7 @@
           <w:sz w:val="22"/>
           <w:szCs w:val="22"/>
         </w:rPr>
-        <w:t xml:space="preserve">Crea la clase abstracta </w:t>
+        <w:t xml:space="preserve">Clase abstracta </w:t>
       </w:r>
       <w:r>
         <w:rPr>
@@ -557,7 +557,26 @@
           <w:sz w:val="22"/>
           <w:szCs w:val="22"/>
         </w:rPr>
-        <w:t xml:space="preserve"> abstracto y </w:t>
+        <w:t xml:space="preserve"> </w:t>
+      </w:r>
+      <w:r>
+        <w:rPr>
+          <w:rFonts w:ascii="Times New Roman" w:hAnsi="Times New Roman" w:cs="Times New Roman"/>
+          <w:b/>
+          <w:color w:val="000000"/>
+          <w:sz w:val="22"/>
+          <w:szCs w:val="22"/>
+        </w:rPr>
+        <w:t xml:space="preserve">abstracto</w:t>
+      </w:r>
+      <w:r>
+        <w:rPr>
+          <w:rFonts w:ascii="Times New Roman" w:hAnsi="Times New Roman" w:cs="Times New Roman"/>
+          <w:color w:val="000000"/>
+          <w:sz w:val="22"/>
+          <w:szCs w:val="22"/>
+        </w:rPr>
+        <w:t xml:space="preserve"> y </w:t>
       </w:r>
       <w:r>
         <w:rPr>
@@ -575,7 +594,44 @@
           <w:sz w:val="22"/>
           <w:szCs w:val="22"/>
         </w:rPr>
-        <w:t xml:space="preserve"> concreto.</w:t>
+        <w:t xml:space="preserve"> </w:t>
+      </w:r>
+      <w:r>
+        <w:rPr>
+          <w:rFonts w:ascii="Times New Roman" w:hAnsi="Times New Roman" w:cs="Times New Roman"/>
+          <w:b/>
+          <w:color w:val="000000"/>
+          <w:sz w:val="22"/>
+          <w:szCs w:val="22"/>
+        </w:rPr>
+        <w:t xml:space="preserve">concreto</w:t>
+      </w:r>
+      <w:r>
+        <w:rPr>
+          <w:rFonts w:ascii="Times New Roman" w:hAnsi="Times New Roman" w:cs="Times New Roman"/>
+          <w:color w:val="000000"/>
+          <w:sz w:val="22"/>
+          <w:szCs w:val="22"/>
+        </w:rPr>
+        <w:t xml:space="preserve"> que use </w:t>
+      </w:r>
+      <w:r>
+        <w:rPr>
+          <w:rFonts w:ascii="Consolas" w:hAnsi="Consolas" w:cs="Consolas"/>
+          <w:color w:val="000000"/>
+          <w:sz w:val="22"/>
+          <w:szCs w:val="22"/>
+        </w:rPr>
+        <w:t xml:space="preserve">area()</w:t>
+      </w:r>
+      <w:r>
+        <w:rPr>
+          <w:rFonts w:ascii="Times New Roman" w:hAnsi="Times New Roman" w:cs="Times New Roman"/>
+          <w:color w:val="000000"/>
+          <w:sz w:val="22"/>
+          <w:szCs w:val="22"/>
+        </w:rPr>
+        <w:t xml:space="preserve">.</w:t>
       </w:r>
     </w:p>
     <w:p>
@@ -599,7 +655,7 @@
           <w:sz w:val="22"/>
           <w:szCs w:val="22"/>
         </w:rPr>
-        <w:t xml:space="preserve">Crea </w:t>
+        <w:t xml:space="preserve">Subclases </w:t>
       </w:r>
       <w:r>
         <w:rPr>
@@ -617,7 +673,7 @@
           <w:sz w:val="22"/>
           <w:szCs w:val="22"/>
         </w:rPr>
-        <w:t xml:space="preserve"> y </w:t>
+        <w:t xml:space="preserve">, </w:t>
       </w:r>
       <w:r>
         <w:rPr>
@@ -627,6 +683,24 @@
           <w:szCs w:val="22"/>
         </w:rPr>
         <w:t xml:space="preserve">Rectangulo</w:t>
+      </w:r>
+      <w:r>
+        <w:rPr>
+          <w:rFonts w:ascii="Times New Roman" w:hAnsi="Times New Roman" w:cs="Times New Roman"/>
+          <w:color w:val="000000"/>
+          <w:sz w:val="22"/>
+          <w:szCs w:val="22"/>
+        </w:rPr>
+        <w:t xml:space="preserve">, </w:t>
+      </w:r>
+      <w:r>
+        <w:rPr>
+          <w:rFonts w:ascii="Consolas" w:hAnsi="Consolas" w:cs="Consolas"/>
+          <w:color w:val="000000"/>
+          <w:sz w:val="22"/>
+          <w:szCs w:val="22"/>
+        </w:rPr>
+        <w:t xml:space="preserve">Triangulo</w:t>
       </w:r>
       <w:r>
         <w:rPr>
@@ -677,7 +751,7 @@
           <w:sz w:val="22"/>
           <w:szCs w:val="22"/>
         </w:rPr>
-        <w:t xml:space="preserve">Define la interfaz </w:t>
+        <w:t xml:space="preserve">Interfaz </w:t>
       </w:r>
       <w:r>
         <w:rPr>
@@ -713,7 +787,7 @@
           <w:sz w:val="22"/>
           <w:szCs w:val="22"/>
         </w:rPr>
-        <w:t xml:space="preserve"> e impleméntala en ambas figuras.</w:t>
+        <w:t xml:space="preserve">, implementada por las tres figuras.</w:t>
       </w:r>
     </w:p>
     <w:p>
@@ -746,16 +820,40 @@
           <w:sz w:val="22"/>
           <w:szCs w:val="22"/>
         </w:rPr>
-        <w:t xml:space="preserve">main</w:t>
-      </w:r>
-      <w:r>
-        <w:rPr>
-          <w:rFonts w:ascii="Times New Roman" w:hAnsi="Times New Roman" w:cs="Times New Roman"/>
-          <w:color w:val="000000"/>
-          <w:sz w:val="22"/>
-          <w:szCs w:val="22"/>
-        </w:rPr>
-        <w:t xml:space="preserve">, recorre un </w:t>
+        <w:t xml:space="preserve">Main</w:t>
+      </w:r>
+      <w:r>
+        <w:rPr>
+          <w:rFonts w:ascii="Times New Roman" w:hAnsi="Times New Roman" w:cs="Times New Roman"/>
+          <w:color w:val="000000"/>
+          <w:sz w:val="22"/>
+          <w:szCs w:val="22"/>
+        </w:rPr>
+        <w:t xml:space="preserve">:</w:t>
+      </w:r>
+    </w:p>
+    <w:p>
+      <w:pPr>
+        <w:spacing w:after="120" w:line="276" w:lineRule="auto"/>
+        <w:ind w:left="454" w:hanging="284"/>
+      </w:pPr>
+      <w:r>
+        <w:rPr>
+          <w:rFonts w:ascii="Times New Roman" w:hAnsi="Times New Roman" w:cs="Times New Roman"/>
+          <w:color w:val="000000"/>
+          <w:sz w:val="22"/>
+          <w:szCs w:val="22"/>
+        </w:rPr>
+        <w:t xml:space="preserve">•	</w:t>
+      </w:r>
+      <w:r>
+        <w:rPr>
+          <w:rFonts w:ascii="Times New Roman" w:hAnsi="Times New Roman" w:cs="Times New Roman"/>
+          <w:color w:val="000000"/>
+          <w:sz w:val="22"/>
+          <w:szCs w:val="22"/>
+        </w:rPr>
+        <w:t xml:space="preserve">Recorre un </w:t>
       </w:r>
       <w:r>
         <w:rPr>
@@ -773,7 +871,7 @@
           <w:sz w:val="22"/>
           <w:szCs w:val="22"/>
         </w:rPr>
-        <w:t xml:space="preserve"> mostrando área; y un </w:t>
+        <w:t xml:space="preserve"> mostrando </w:t>
       </w:r>
       <w:r>
         <w:rPr>
@@ -782,6 +880,67 @@
           <w:sz w:val="22"/>
           <w:szCs w:val="22"/>
         </w:rPr>
+        <w:t xml:space="preserve">describir()</w:t>
+      </w:r>
+      <w:r>
+        <w:rPr>
+          <w:rFonts w:ascii="Times New Roman" w:hAnsi="Times New Roman" w:cs="Times New Roman"/>
+          <w:color w:val="000000"/>
+          <w:sz w:val="22"/>
+          <w:szCs w:val="22"/>
+        </w:rPr>
+        <w:t xml:space="preserve"> (polimorfismo por </w:t>
+      </w:r>
+      <w:r>
+        <w:rPr>
+          <w:rFonts w:ascii="Times New Roman" w:hAnsi="Times New Roman" w:cs="Times New Roman"/>
+          <w:b/>
+          <w:color w:val="000000"/>
+          <w:sz w:val="22"/>
+          <w:szCs w:val="22"/>
+        </w:rPr>
+        <w:t xml:space="preserve">superclase</w:t>
+      </w:r>
+      <w:r>
+        <w:rPr>
+          <w:rFonts w:ascii="Times New Roman" w:hAnsi="Times New Roman" w:cs="Times New Roman"/>
+          <w:color w:val="000000"/>
+          <w:sz w:val="22"/>
+          <w:szCs w:val="22"/>
+        </w:rPr>
+        <w:t xml:space="preserve">).</w:t>
+      </w:r>
+    </w:p>
+    <w:p>
+      <w:pPr>
+        <w:spacing w:after="120" w:line="276" w:lineRule="auto"/>
+        <w:ind w:left="454" w:hanging="284"/>
+      </w:pPr>
+      <w:r>
+        <w:rPr>
+          <w:rFonts w:ascii="Times New Roman" w:hAnsi="Times New Roman" w:cs="Times New Roman"/>
+          <w:color w:val="000000"/>
+          <w:sz w:val="22"/>
+          <w:szCs w:val="22"/>
+        </w:rPr>
+        <w:t xml:space="preserve">•	</w:t>
+      </w:r>
+      <w:r>
+        <w:rPr>
+          <w:rFonts w:ascii="Times New Roman" w:hAnsi="Times New Roman" w:cs="Times New Roman"/>
+          <w:color w:val="000000"/>
+          <w:sz w:val="22"/>
+          <w:szCs w:val="22"/>
+        </w:rPr>
+        <w:t xml:space="preserve">Recorre un </w:t>
+      </w:r>
+      <w:r>
+        <w:rPr>
+          <w:rFonts w:ascii="Consolas" w:hAnsi="Consolas" w:cs="Consolas"/>
+          <w:color w:val="000000"/>
+          <w:sz w:val="22"/>
+          <w:szCs w:val="22"/>
+        </w:rPr>
         <w:t xml:space="preserve">Dibujable[]</w:t>
       </w:r>
       <w:r>
@@ -809,7 +968,87 @@
           <w:sz w:val="22"/>
           <w:szCs w:val="22"/>
         </w:rPr>
-        <w:t xml:space="preserve">.</w:t>
+        <w:t xml:space="preserve"> (polimorfismo por </w:t>
+      </w:r>
+      <w:r>
+        <w:rPr>
+          <w:rFonts w:ascii="Times New Roman" w:hAnsi="Times New Roman" w:cs="Times New Roman"/>
+          <w:b/>
+          <w:color w:val="000000"/>
+          <w:sz w:val="22"/>
+          <w:szCs w:val="22"/>
+        </w:rPr>
+        <w:t xml:space="preserve">interfaz</w:t>
+      </w:r>
+      <w:r>
+        <w:rPr>
+          <w:rFonts w:ascii="Times New Roman" w:hAnsi="Times New Roman" w:cs="Times New Roman"/>
+          <w:color w:val="000000"/>
+          <w:sz w:val="22"/>
+          <w:szCs w:val="22"/>
+        </w:rPr>
+        <w:t xml:space="preserve">).</w:t>
+      </w:r>
+    </w:p>
+    <w:p>
+      <w:pPr>
+        <w:spacing w:after="120" w:line="276" w:lineRule="auto"/>
+        <w:ind w:left="454" w:hanging="284"/>
+      </w:pPr>
+      <w:r>
+        <w:rPr>
+          <w:rFonts w:ascii="Times New Roman" w:hAnsi="Times New Roman" w:cs="Times New Roman"/>
+          <w:color w:val="000000"/>
+          <w:sz w:val="22"/>
+          <w:szCs w:val="22"/>
+        </w:rPr>
+        <w:t xml:space="preserve">1.	</w:t>
+      </w:r>
+      <w:r>
+        <w:rPr>
+          <w:rFonts w:ascii="Times New Roman" w:hAnsi="Times New Roman" w:cs="Times New Roman"/>
+          <w:color w:val="000000"/>
+          <w:sz w:val="22"/>
+          <w:szCs w:val="22"/>
+        </w:rPr>
+        <w:t xml:space="preserve">Verifica que </w:t>
+      </w:r>
+      <w:r>
+        <w:rPr>
+          <w:rFonts w:ascii="Consolas" w:hAnsi="Consolas" w:cs="Consolas"/>
+          <w:color w:val="000000"/>
+          <w:sz w:val="22"/>
+          <w:szCs w:val="22"/>
+        </w:rPr>
+        <w:t xml:space="preserve">new Figura()</w:t>
+      </w:r>
+      <w:r>
+        <w:rPr>
+          <w:rFonts w:ascii="Times New Roman" w:hAnsi="Times New Roman" w:cs="Times New Roman"/>
+          <w:color w:val="000000"/>
+          <w:sz w:val="22"/>
+          <w:szCs w:val="22"/>
+        </w:rPr>
+        <w:t xml:space="preserve"> </w:t>
+      </w:r>
+      <w:r>
+        <w:rPr>
+          <w:rFonts w:ascii="Times New Roman" w:hAnsi="Times New Roman" w:cs="Times New Roman"/>
+          <w:b/>
+          <w:color w:val="000000"/>
+          <w:sz w:val="22"/>
+          <w:szCs w:val="22"/>
+        </w:rPr>
+        <w:t xml:space="preserve">no compila</w:t>
+      </w:r>
+      <w:r>
+        <w:rPr>
+          <w:rFonts w:ascii="Times New Roman" w:hAnsi="Times New Roman" w:cs="Times New Roman"/>
+          <w:color w:val="000000"/>
+          <w:sz w:val="22"/>
+          <w:szCs w:val="22"/>
+        </w:rPr>
+        <w:t xml:space="preserve"> (coméntalo y explica por qué).</w:t>
       </w:r>
     </w:p>
     <w:p>
@@ -852,7 +1091,7 @@
           <w:sz w:val="22"/>
           <w:szCs w:val="22"/>
         </w:rPr>
-        <w:t xml:space="preserve">Clase abstracta + método abstracto implementado en subclases.</w:t>
+        <w:t xml:space="preserve">Clase abstracta con método abstracto implementado en subclases.</w:t>
       </w:r>
     </w:p>
     <w:p>
@@ -900,7 +1139,50 @@
           <w:sz w:val="22"/>
           <w:szCs w:val="22"/>
         </w:rPr>
-        <w:t xml:space="preserve">Uso polimórfico por superclase y por interfaz.</w:t>
+        <w:t xml:space="preserve">Uso polimórfico por superclase </w:t>
+      </w:r>
+      <w:r>
+        <w:rPr>
+          <w:rFonts w:ascii="Times New Roman" w:hAnsi="Times New Roman" w:cs="Times New Roman"/>
+          <w:b/>
+          <w:color w:val="000000"/>
+          <w:sz w:val="22"/>
+          <w:szCs w:val="22"/>
+        </w:rPr>
+        <w:t xml:space="preserve">y</w:t>
+      </w:r>
+      <w:r>
+        <w:rPr>
+          <w:rFonts w:ascii="Times New Roman" w:hAnsi="Times New Roman" w:cs="Times New Roman"/>
+          <w:color w:val="000000"/>
+          <w:sz w:val="22"/>
+          <w:szCs w:val="22"/>
+        </w:rPr>
+        <w:t xml:space="preserve"> por interfaz.</w:t>
+      </w:r>
+    </w:p>
+    <w:p>
+      <w:pPr>
+        <w:spacing w:after="120" w:line="276" w:lineRule="auto"/>
+        <w:ind w:left="454" w:hanging="284"/>
+      </w:pPr>
+      <w:r>
+        <w:rPr>
+          <w:rFonts w:ascii="Times New Roman" w:hAnsi="Times New Roman" w:cs="Times New Roman"/>
+          <w:color w:val="000000"/>
+          <w:sz w:val="22"/>
+          <w:szCs w:val="22"/>
+        </w:rPr>
+        <w:t xml:space="preserve">•	</w:t>
+      </w:r>
+      <w:r>
+        <w:rPr>
+          <w:rFonts w:ascii="Times New Roman" w:hAnsi="Times New Roman" w:cs="Times New Roman"/>
+          <w:color w:val="000000"/>
+          <w:sz w:val="22"/>
+          <w:szCs w:val="22"/>
+        </w:rPr>
+        <w:t xml:space="preserve">Explicación de por qué no se puede instanciar la abstracta.</w:t>
       </w:r>
     </w:p>
     <w:p>
@@ -1003,7 +1285,7 @@
           <w:sz w:val="18"/>
           <w:szCs w:val="18"/>
         </w:rPr>
-        <w:t xml:space="preserve">  README.md   -&gt; salida de ejemplo</w:t>
+        <w:t xml:space="preserve">  README.md   -&gt; salida + por que Figura no se instancia + interfaz vs abstracta</w:t>
       </w:r>
     </w:p>
     <w:p>
@@ -1043,7 +1325,7 @@
           <w:sz w:val="22"/>
           <w:szCs w:val="22"/>
         </w:rPr>
-        <w:t xml:space="preserve">Crea el repo público con ese nombre.</w:t>
+        <w:t xml:space="preserve">Crea el repositorio público con ese nombre.</w:t>
       </w:r>
     </w:p>
     <w:p>
@@ -1091,7 +1373,7 @@
           <w:sz w:val="22"/>
           <w:szCs w:val="22"/>
         </w:rPr>
-        <w:t xml:space="preserve">Comparte el enlace por el canal indicado.</w:t>
+        <w:t xml:space="preserve">Comparte el enlace por el canal indicado por el docente.</w:t>
       </w:r>
     </w:p>
     <w:p>
@@ -1174,7 +1456,7 @@
                 <w:sz w:val="20"/>
                 <w:szCs w:val="20"/>
               </w:rPr>
-              <w:t xml:space="preserve">Excelente</w:t>
+              <w:t xml:space="preserve">Excelente (100%)</w:t>
             </w:r>
           </w:p>
         </w:tc>
@@ -1196,7 +1478,7 @@
                 <w:sz w:val="20"/>
                 <w:szCs w:val="20"/>
               </w:rPr>
-              <w:t xml:space="preserve">Aceptable</w:t>
+              <w:t xml:space="preserve">Aceptable (60%)</w:t>
             </w:r>
           </w:p>
         </w:tc>
@@ -1218,7 +1500,7 @@
                 <w:sz w:val="20"/>
                 <w:szCs w:val="20"/>
               </w:rPr>
-              <w:t xml:space="preserve">Por mejorar</w:t>
+              <w:t xml:space="preserve">Por mejorar (0%)</w:t>
             </w:r>
           </w:p>
         </w:tc>
@@ -1262,7 +1544,7 @@
                 <w:sz w:val="20"/>
                 <w:szCs w:val="20"/>
               </w:rPr>
-              <w:t xml:space="preserve">Clase abstracta + abstracto</w:t>
+              <w:t xml:space="preserve">Clase abstracta + método abstracto</w:t>
             </w:r>
           </w:p>
         </w:tc>
@@ -1342,7 +1624,7 @@
                 <w:sz w:val="20"/>
                 <w:szCs w:val="20"/>
               </w:rPr>
-              <w:t xml:space="preserve">30</w:t>
+              <w:t xml:space="preserve">25</w:t>
             </w:r>
           </w:p>
         </w:tc>
@@ -1444,7 +1726,7 @@
                 <w:sz w:val="20"/>
                 <w:szCs w:val="20"/>
               </w:rPr>
-              <w:t xml:space="preserve">30</w:t>
+              <w:t xml:space="preserve">25</w:t>
             </w:r>
           </w:p>
         </w:tc>
@@ -1486,7 +1768,7 @@
                 <w:sz w:val="20"/>
                 <w:szCs w:val="20"/>
               </w:rPr>
-              <w:t xml:space="preserve">Correcto</w:t>
+              <w:t xml:space="preserve">Ambos correctos</w:t>
             </w:r>
           </w:p>
         </w:tc>
@@ -1506,7 +1788,7 @@
                 <w:sz w:val="20"/>
                 <w:szCs w:val="20"/>
               </w:rPr>
-              <w:t xml:space="preserve">Parcial</w:t>
+              <w:t xml:space="preserve">Uno</w:t>
             </w:r>
           </w:p>
         </w:tc>
@@ -1546,7 +1828,7 @@
                 <w:sz w:val="20"/>
                 <w:szCs w:val="20"/>
               </w:rPr>
-              <w:t xml:space="preserve">25</w:t>
+              <w:t xml:space="preserve">30</w:t>
             </w:r>
           </w:p>
         </w:tc>
@@ -1568,7 +1850,7 @@
                 <w:sz w:val="20"/>
                 <w:szCs w:val="20"/>
               </w:rPr>
-              <w:t xml:space="preserve">README y repositorio</w:t>
+              <w:t xml:space="preserve">README (abstracta vs interfaz + no-instanciable)</w:t>
             </w:r>
           </w:p>
         </w:tc>
@@ -1588,7 +1870,7 @@
                 <w:sz w:val="20"/>
                 <w:szCs w:val="20"/>
               </w:rPr>
-              <w:t xml:space="preserve">Ordenado</w:t>
+              <w:t xml:space="preserve">Claro</w:t>
             </w:r>
           </w:p>
         </w:tc>
@@ -1608,7 +1890,7 @@
                 <w:sz w:val="20"/>
                 <w:szCs w:val="20"/>
               </w:rPr>
-              <w:t xml:space="preserve">Aceptable</w:t>
+              <w:t xml:space="preserve">Básico</w:t>
             </w:r>
           </w:p>
         </w:tc>
@@ -1628,7 +1910,7 @@
                 <w:sz w:val="20"/>
                 <w:szCs w:val="20"/>
               </w:rPr>
-              <w:t xml:space="preserve">Deficiente</w:t>
+              <w:t xml:space="preserve">Ausente</w:t>
             </w:r>
           </w:p>
         </w:tc>
@@ -1648,7 +1930,7 @@
                 <w:sz w:val="20"/>
                 <w:szCs w:val="20"/>
               </w:rPr>
-              <w:t xml:space="preserve">15</w:t>
+              <w:t xml:space="preserve">20</w:t>
             </w:r>
           </w:p>
         </w:tc>
@@ -1667,7 +1949,7 @@
           <w:sz w:val="21"/>
           <w:szCs w:val="21"/>
         </w:rPr>
-        <w:t xml:space="preserve">Nota: actividad formativa y opcional (sin nota en Moodle). La guía unificada de entrega estará en el Manual de Entrega de Actividades Opcionales (próximamente).</w:t>
+        <w:t xml:space="preserve">Nota: actividad formativa y opcional (sin nota en Moodle). La guía unificada para entregar todas las actividades opcionales, válida para todas las materias, estará en el Manual de Entrega de Actividades Opcionales (próximamente).</w:t>
       </w:r>
     </w:p>
     <w:sectPr>

</xml_diff>